<commit_message>
Ajustes al contrato de IDNEE y al codigo de generador de documento para que se valide con otras plantillas
</commit_message>
<xml_diff>
--- a/documentos/plantillas/plantilla_cpse_IDINEE.docx
+++ b/documentos/plantillas/plantilla_cpse_IDINEE.docx
@@ -58,7 +58,7 @@
           <w:szCs w:val="18"/>
           <w:highlight w:val="yellow"/>
         </w:rPr>
-        <w:t>XXX</w:t>
+        <w:t>{{INICIO}}</w:t>
       </w:r>
       <w:r>
         <w:rPr>
@@ -1527,16 +1527,25 @@
         <w:rPr>
           <w:sz w:val="18"/>
           <w:szCs w:val="18"/>
-        </w:rPr>
-        <w:t>(</w:t>
-      </w:r>
-      <w:r>
-        <w:rPr>
-          <w:sz w:val="18"/>
-          <w:szCs w:val="18"/>
           <w:highlight w:val="yellow"/>
         </w:rPr>
-        <w:t>NOMBRE DEL CLIENTE)</w:t>
+        <w:t>{{</w:t>
+      </w:r>
+      <w:r>
+        <w:rPr>
+          <w:sz w:val="18"/>
+          <w:szCs w:val="18"/>
+          <w:highlight w:val="yellow"/>
+        </w:rPr>
+        <w:t>CLIENTE</w:t>
+      </w:r>
+      <w:r>
+        <w:rPr>
+          <w:sz w:val="18"/>
+          <w:szCs w:val="18"/>
+          <w:highlight w:val="yellow"/>
+        </w:rPr>
+        <w:t>}}</w:t>
       </w:r>
     </w:p>
     <w:p>
@@ -1562,31 +1571,11 @@
       </w:r>
       <w:r>
         <w:rPr>
-          <w:b/>
-          <w:bCs/>
-          <w:sz w:val="18"/>
-          <w:szCs w:val="18"/>
-        </w:rPr>
-        <w:t>(</w:t>
-      </w:r>
-      <w:r>
-        <w:rPr>
-          <w:b/>
-          <w:bCs/>
           <w:sz w:val="18"/>
           <w:szCs w:val="18"/>
           <w:highlight w:val="yellow"/>
         </w:rPr>
-        <w:t>NOMBRE DEL CLIENTE</w:t>
-      </w:r>
-      <w:r>
-        <w:rPr>
-          <w:b/>
-          <w:bCs/>
-          <w:sz w:val="18"/>
-          <w:szCs w:val="18"/>
-        </w:rPr>
-        <w:t>)</w:t>
+        <w:t>{{INICIO}}</w:t>
       </w:r>
       <w:r>
         <w:rPr>
@@ -1723,26 +1712,25 @@
         <w:rPr>
           <w:sz w:val="18"/>
           <w:szCs w:val="18"/>
-        </w:rPr>
-        <w:t>(</w:t>
-      </w:r>
-      <w:r>
-        <w:rPr>
-          <w:b/>
-          <w:bCs/>
-          <w:sz w:val="18"/>
-          <w:szCs w:val="18"/>
-        </w:rPr>
-        <w:t>NOMBRE DEL CLIENTE</w:t>
-      </w:r>
-      <w:r>
-        <w:rPr>
-          <w:b/>
-          <w:bCs/>
-          <w:sz w:val="18"/>
-          <w:szCs w:val="18"/>
-        </w:rPr>
-        <w:t>)</w:t>
+          <w:highlight w:val="yellow"/>
+        </w:rPr>
+        <w:t>{{</w:t>
+      </w:r>
+      <w:r>
+        <w:rPr>
+          <w:sz w:val="18"/>
+          <w:szCs w:val="18"/>
+          <w:highlight w:val="yellow"/>
+        </w:rPr>
+        <w:t>CLIENTE</w:t>
+      </w:r>
+      <w:r>
+        <w:rPr>
+          <w:sz w:val="18"/>
+          <w:szCs w:val="18"/>
+          <w:highlight w:val="yellow"/>
+        </w:rPr>
+        <w:t>}}</w:t>
       </w:r>
       <w:r>
         <w:rPr>
@@ -1766,7 +1754,6 @@
         </w:rPr>
         <w:t xml:space="preserve">de </w:t>
       </w:r>
-      <w:proofErr w:type="spellStart"/>
       <w:r>
         <w:rPr>
           <w:sz w:val="18"/>
@@ -1775,7 +1762,6 @@
         </w:rPr>
         <w:t>XXXXX</w:t>
       </w:r>
-      <w:proofErr w:type="spellEnd"/>
       <w:r>
         <w:rPr>
           <w:sz w:val="18"/>
@@ -1857,31 +1843,27 @@
       </w:r>
       <w:r>
         <w:rPr>
-          <w:b/>
-          <w:bCs/>
-          <w:sz w:val="18"/>
-          <w:szCs w:val="18"/>
-        </w:rPr>
-        <w:t>(</w:t>
-      </w:r>
-      <w:r>
-        <w:rPr>
-          <w:b/>
-          <w:bCs/>
           <w:sz w:val="18"/>
           <w:szCs w:val="18"/>
           <w:highlight w:val="yellow"/>
         </w:rPr>
-        <w:t>DIRECCIÓN DEL CLIENTE</w:t>
-      </w:r>
-      <w:r>
-        <w:rPr>
-          <w:b/>
-          <w:bCs/>
-          <w:sz w:val="18"/>
-          <w:szCs w:val="18"/>
-        </w:rPr>
-        <w:t>)</w:t>
+        <w:t>{{</w:t>
+      </w:r>
+      <w:r>
+        <w:rPr>
+          <w:sz w:val="18"/>
+          <w:szCs w:val="18"/>
+          <w:highlight w:val="yellow"/>
+        </w:rPr>
+        <w:t>DOMFISCAL</w:t>
+      </w:r>
+      <w:r>
+        <w:rPr>
+          <w:sz w:val="18"/>
+          <w:szCs w:val="18"/>
+          <w:highlight w:val="yellow"/>
+        </w:rPr>
+        <w:t>}}</w:t>
       </w:r>
       <w:r>
         <w:rPr>
@@ -1900,22 +1882,27 @@
       <w:bookmarkStart w:id="0" w:name="_Hlk205811535"/>
       <w:r>
         <w:rPr>
-          <w:b/>
-          <w:bCs/>
-          <w:sz w:val="18"/>
-          <w:szCs w:val="18"/>
-        </w:rPr>
-        <w:t>(</w:t>
-      </w:r>
-      <w:r>
-        <w:rPr>
-          <w:b/>
-          <w:bCs/>
           <w:sz w:val="18"/>
           <w:szCs w:val="18"/>
           <w:highlight w:val="yellow"/>
         </w:rPr>
-        <w:t>RFC DEL CLIENTE)</w:t>
+        <w:t>{{</w:t>
+      </w:r>
+      <w:r>
+        <w:rPr>
+          <w:sz w:val="18"/>
+          <w:szCs w:val="18"/>
+          <w:highlight w:val="yellow"/>
+        </w:rPr>
+        <w:t>RFC</w:t>
+      </w:r>
+      <w:r>
+        <w:rPr>
+          <w:sz w:val="18"/>
+          <w:szCs w:val="18"/>
+          <w:highlight w:val="yellow"/>
+        </w:rPr>
+        <w:t>}}</w:t>
       </w:r>
       <w:r>
         <w:rPr>
@@ -2142,137 +2129,50 @@
         </w:rPr>
         <w:t xml:space="preserve">Por medio del presente Contrato, las Partes acuerdan que a partir de la Fecha Efectiva y hasta el día </w:t>
       </w:r>
-      <w:proofErr w:type="spellStart"/>
       <w:r>
         <w:rPr>
           <w:sz w:val="18"/>
           <w:szCs w:val="18"/>
           <w:highlight w:val="yellow"/>
         </w:rPr>
-        <w:t>xx</w:t>
-      </w:r>
-      <w:proofErr w:type="spellEnd"/>
+        <w:t>{{</w:t>
+      </w:r>
       <w:r>
         <w:rPr>
           <w:sz w:val="18"/>
           <w:szCs w:val="18"/>
           <w:highlight w:val="yellow"/>
         </w:rPr>
-        <w:t xml:space="preserve"> de </w:t>
-      </w:r>
-      <w:proofErr w:type="spellStart"/>
+        <w:t>FIN</w:t>
+      </w:r>
       <w:r>
         <w:rPr>
           <w:sz w:val="18"/>
           <w:szCs w:val="18"/>
           <w:highlight w:val="yellow"/>
         </w:rPr>
-        <w:t>xx</w:t>
-      </w:r>
-      <w:proofErr w:type="spellEnd"/>
-      <w:r>
-        <w:rPr>
-          <w:sz w:val="18"/>
-          <w:szCs w:val="18"/>
-          <w:highlight w:val="yellow"/>
-        </w:rPr>
-        <w:t xml:space="preserve"> del </w:t>
-      </w:r>
-      <w:proofErr w:type="spellStart"/>
-      <w:r>
-        <w:rPr>
-          <w:sz w:val="18"/>
-          <w:szCs w:val="18"/>
-          <w:highlight w:val="yellow"/>
-        </w:rPr>
-        <w:t>xx</w:t>
-      </w:r>
-      <w:proofErr w:type="spellEnd"/>
-      <w:r>
-        <w:rPr>
-          <w:sz w:val="18"/>
-          <w:szCs w:val="18"/>
-          <w:highlight w:val="yellow"/>
-        </w:rPr>
-        <w:t xml:space="preserve"> (la “Vigencia</w:t>
-      </w:r>
-      <w:r>
-        <w:rPr>
-          <w:sz w:val="18"/>
-          <w:szCs w:val="18"/>
-        </w:rPr>
-        <w:t xml:space="preserve">”) el </w:t>
-      </w:r>
-      <w:r>
-        <w:rPr>
-          <w:sz w:val="18"/>
-          <w:szCs w:val="18"/>
-        </w:rPr>
-        <w:t>Prestador realizará los servicios especializados en materia de consultoría, asesoría y representación empresarial, contable, financiera, fiscal, legal, administrativa y corporativa, según se describe en el Anexo 1 (los "Servicios"), todo ello dentro del alcance de las actividades autorizadas conforme al Registro de Prestadores de Servicios Especializados u Obras Especializadas (</w:t>
-      </w:r>
-      <w:proofErr w:type="spellStart"/>
-      <w:r>
-        <w:rPr>
-          <w:sz w:val="18"/>
-          <w:szCs w:val="18"/>
-        </w:rPr>
-        <w:t>REPSE</w:t>
-      </w:r>
-      <w:proofErr w:type="spellEnd"/>
-      <w:r>
-        <w:rPr>
-          <w:sz w:val="18"/>
-          <w:szCs w:val="18"/>
-        </w:rPr>
-        <w:t xml:space="preserve">) número </w:t>
-      </w:r>
-      <w:proofErr w:type="spellStart"/>
-      <w:r>
-        <w:rPr>
-          <w:sz w:val="18"/>
-          <w:szCs w:val="18"/>
-        </w:rPr>
-        <w:t>STPS</w:t>
-      </w:r>
-      <w:proofErr w:type="spellEnd"/>
-      <w:r>
-        <w:rPr>
-          <w:sz w:val="18"/>
-          <w:szCs w:val="18"/>
-        </w:rPr>
-        <w:t>/</w:t>
-      </w:r>
-      <w:proofErr w:type="spellStart"/>
-      <w:r>
-        <w:rPr>
-          <w:sz w:val="18"/>
-          <w:szCs w:val="18"/>
-        </w:rPr>
-        <w:t>UTD</w:t>
-      </w:r>
-      <w:proofErr w:type="spellEnd"/>
-      <w:r>
-        <w:rPr>
-          <w:sz w:val="18"/>
-          <w:szCs w:val="18"/>
-        </w:rPr>
-        <w:t>/</w:t>
-      </w:r>
-      <w:proofErr w:type="spellStart"/>
-      <w:r>
-        <w:rPr>
-          <w:sz w:val="18"/>
-          <w:szCs w:val="18"/>
-        </w:rPr>
-        <w:t>DGIFT</w:t>
-      </w:r>
-      <w:proofErr w:type="spellEnd"/>
-      <w:r>
-        <w:rPr>
-          <w:sz w:val="18"/>
-          <w:szCs w:val="18"/>
-        </w:rPr>
-        <w:t>/AR211268/2026</w:t>
+        <w:t>}}</w:t>
+      </w:r>
+      <w:r>
+        <w:rPr>
+          <w:sz w:val="18"/>
+          <w:szCs w:val="18"/>
+        </w:rPr>
+        <w:t xml:space="preserve"> </w:t>
+      </w:r>
+      <w:r>
+        <w:rPr>
+          <w:sz w:val="18"/>
+          <w:szCs w:val="18"/>
+        </w:rPr>
+        <w:t xml:space="preserve">el </w:t>
+      </w:r>
+      <w:r>
+        <w:rPr>
+          <w:sz w:val="18"/>
+          <w:szCs w:val="18"/>
+        </w:rPr>
+        <w:t>Prestador realizará los servicios especializados en materia de consultoría, asesoría y representación empresarial, contable, financiera, fiscal, legal, administrativa y corporativa, según se describe en el Anexo 1 (los "Servicios"), todo ello dentro del alcance de las actividades autorizadas conforme al Registro de Prestadores de Servicios Especializados u Obras Especializadas (REPSE) número STPS/UTD/DGIFT/AR211268/2026</w:t>
       </w:r>
       <w:r>
         <w:rPr>
@@ -3045,23 +2945,7 @@
           <w:sz w:val="18"/>
           <w:szCs w:val="18"/>
         </w:rPr>
-        <w:t xml:space="preserve">" con la entrega de </w:t>
-      </w:r>
-      <w:proofErr w:type="gramStart"/>
-      <w:r>
-        <w:rPr>
-          <w:sz w:val="18"/>
-          <w:szCs w:val="18"/>
-        </w:rPr>
-        <w:t>los mismos</w:t>
-      </w:r>
-      <w:proofErr w:type="gramEnd"/>
-      <w:r>
-        <w:rPr>
-          <w:sz w:val="18"/>
-          <w:szCs w:val="18"/>
-        </w:rPr>
-        <w:t xml:space="preserve"> conforme a lo pactado.</w:t>
+        <w:t>" con la entrega de los mismos conforme a lo pactado.</w:t>
       </w:r>
     </w:p>
     <w:p>
@@ -5092,21 +4976,12 @@
         </w:rPr>
         <w:t>“</w:t>
       </w:r>
-      <w:proofErr w:type="spellStart"/>
-      <w:r>
-        <w:rPr>
-          <w:sz w:val="18"/>
-          <w:szCs w:val="18"/>
-        </w:rPr>
-        <w:t>UK</w:t>
-      </w:r>
-      <w:proofErr w:type="spellEnd"/>
-      <w:r>
-        <w:rPr>
-          <w:sz w:val="18"/>
-          <w:szCs w:val="18"/>
-        </w:rPr>
-        <w:t xml:space="preserve"> </w:t>
+      <w:r>
+        <w:rPr>
+          <w:sz w:val="18"/>
+          <w:szCs w:val="18"/>
+        </w:rPr>
+        <w:t xml:space="preserve">UK </w:t>
       </w:r>
       <w:proofErr w:type="spellStart"/>
       <w:r>
@@ -6223,16 +6098,30 @@
         </w:rPr>
         <w:t xml:space="preserve">El presente Contrato podrá celebrarse en uno o varios ejemplares, cada uno de los cuales constituirá un original para todos los efectos, y todos ellos en conjunto constituirán un solo y mismo acuerdo. Una vez leído el presente Contrato por “EL CLIENTE” y “EL PRESTADOR”, y enterados del contenido y alcance legal de todas y cada una de las cláusulas que lo componen, lo firman de entera conformidad en la Ciudad de </w:t>
       </w:r>
-      <w:proofErr w:type="spellStart"/>
       <w:r>
         <w:rPr>
           <w:sz w:val="18"/>
           <w:szCs w:val="18"/>
           <w:highlight w:val="yellow"/>
         </w:rPr>
-        <w:t>XXXXX</w:t>
-      </w:r>
-      <w:proofErr w:type="spellEnd"/>
+        <w:t>{{</w:t>
+      </w:r>
+      <w:r>
+        <w:rPr>
+          <w:sz w:val="18"/>
+          <w:szCs w:val="18"/>
+          <w:highlight w:val="yellow"/>
+        </w:rPr>
+        <w:t>LUGAR_FIRMA</w:t>
+      </w:r>
+      <w:r>
+        <w:rPr>
+          <w:sz w:val="18"/>
+          <w:szCs w:val="18"/>
+          <w:highlight w:val="yellow"/>
+        </w:rPr>
+        <w:t>}}</w:t>
+      </w:r>
       <w:r>
         <w:rPr>
           <w:color w:val="EE0000"/>
@@ -6261,7 +6150,7 @@
           <w:szCs w:val="18"/>
           <w:highlight w:val="yellow"/>
         </w:rPr>
-        <w:t>----------------</w:t>
+        <w:t>{{INICIO}}</w:t>
       </w:r>
       <w:r>
         <w:rPr>
@@ -6701,15 +6590,30 @@
                                 <w:szCs w:val="18"/>
                               </w:rPr>
                             </w:pPr>
-                            <w:proofErr w:type="spellStart"/>
                             <w:r>
                               <w:rPr>
                                 <w:sz w:val="18"/>
                                 <w:szCs w:val="18"/>
+                                <w:highlight w:val="yellow"/>
                               </w:rPr>
-                              <w:t>XXXXXX</w:t>
+                              <w:t>{{</w:t>
                             </w:r>
-                            <w:proofErr w:type="spellEnd"/>
+                            <w:r>
+                              <w:rPr>
+                                <w:sz w:val="18"/>
+                                <w:szCs w:val="18"/>
+                                <w:highlight w:val="yellow"/>
+                              </w:rPr>
+                              <w:t>REPRESENTANTE</w:t>
+                            </w:r>
+                            <w:r>
+                              <w:rPr>
+                                <w:sz w:val="18"/>
+                                <w:szCs w:val="18"/>
+                                <w:highlight w:val="yellow"/>
+                              </w:rPr>
+                              <w:t>}}</w:t>
+                            </w:r>
                             <w:r>
                               <w:rPr>
                                 <w:sz w:val="18"/>
@@ -6756,15 +6660,30 @@
                               </w:rPr>
                               <w:t xml:space="preserve"> </w:t>
                             </w:r>
-                            <w:proofErr w:type="spellStart"/>
                             <w:r>
                               <w:rPr>
                                 <w:sz w:val="18"/>
                                 <w:szCs w:val="18"/>
+                                <w:highlight w:val="yellow"/>
                               </w:rPr>
-                              <w:t>XXXXXX</w:t>
+                              <w:t>{{</w:t>
                             </w:r>
-                            <w:proofErr w:type="spellEnd"/>
+                            <w:r>
+                              <w:rPr>
+                                <w:sz w:val="18"/>
+                                <w:szCs w:val="18"/>
+                                <w:highlight w:val="yellow"/>
+                              </w:rPr>
+                              <w:t>CLIENTE</w:t>
+                            </w:r>
+                            <w:r>
+                              <w:rPr>
+                                <w:sz w:val="18"/>
+                                <w:szCs w:val="18"/>
+                                <w:highlight w:val="yellow"/>
+                              </w:rPr>
+                              <w:t>}}</w:t>
+                            </w:r>
                             <w:r>
                               <w:rPr>
                                 <w:sz w:val="18"/>
@@ -6802,7 +6721,11 @@
           </mc:Choice>
           <mc:Fallback>
             <w:pict>
-              <v:shape w14:anchorId="5330C49A" id="_x0000_s1027" type="#_x0000_t202" style="position:absolute;left:0;text-align:left;margin-left:0;margin-top:64.85pt;width:201pt;height:126.75pt;z-index:251659264;visibility:visible;mso-wrap-style:square;mso-width-percent:0;mso-height-percent:0;mso-wrap-distance-left:9pt;mso-wrap-distance-top:0;mso-wrap-distance-right:9pt;mso-wrap-distance-bottom:0;mso-position-horizontal:left;mso-position-horizontal-relative:margin;mso-position-vertical:absolute;mso-position-vertical-relative:text;mso-width-percent:0;mso-height-percent:0;mso-width-relative:margin;mso-height-relative:margin;v-text-anchor:top" o:gfxdata="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" filled="f" stroked="f" strokeweight=".5pt">
+              <v:shapetype w14:anchorId="5330C49A" id="_x0000_t202" coordsize="21600,21600" o:spt="202" path="m,l,21600r21600,l21600,xe">
+                <v:stroke joinstyle="miter"/>
+                <v:path gradientshapeok="t" o:connecttype="rect"/>
+              </v:shapetype>
+              <v:shape id="_x0000_s1027" type="#_x0000_t202" style="position:absolute;left:0;text-align:left;margin-left:0;margin-top:64.85pt;width:201pt;height:126.75pt;z-index:251659264;visibility:visible;mso-wrap-style:square;mso-width-percent:0;mso-height-percent:0;mso-wrap-distance-left:9pt;mso-wrap-distance-top:0;mso-wrap-distance-right:9pt;mso-wrap-distance-bottom:0;mso-position-horizontal:left;mso-position-horizontal-relative:margin;mso-position-vertical:absolute;mso-position-vertical-relative:text;mso-width-percent:0;mso-height-percent:0;mso-width-relative:margin;mso-height-relative:margin;v-text-anchor:top" o:gfxdata="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" filled="f" stroked="f" strokeweight=".5pt">
                 <v:textbox>
                   <w:txbxContent>
                     <w:p>
@@ -6813,15 +6736,30 @@
                           <w:szCs w:val="18"/>
                         </w:rPr>
                       </w:pPr>
-                      <w:proofErr w:type="spellStart"/>
                       <w:r>
                         <w:rPr>
                           <w:sz w:val="18"/>
                           <w:szCs w:val="18"/>
+                          <w:highlight w:val="yellow"/>
                         </w:rPr>
-                        <w:t>XXXXXX</w:t>
+                        <w:t>{{</w:t>
                       </w:r>
-                      <w:proofErr w:type="spellEnd"/>
+                      <w:r>
+                        <w:rPr>
+                          <w:sz w:val="18"/>
+                          <w:szCs w:val="18"/>
+                          <w:highlight w:val="yellow"/>
+                        </w:rPr>
+                        <w:t>REPRESENTANTE</w:t>
+                      </w:r>
+                      <w:r>
+                        <w:rPr>
+                          <w:sz w:val="18"/>
+                          <w:szCs w:val="18"/>
+                          <w:highlight w:val="yellow"/>
+                        </w:rPr>
+                        <w:t>}}</w:t>
+                      </w:r>
                       <w:r>
                         <w:rPr>
                           <w:sz w:val="18"/>
@@ -6868,15 +6806,30 @@
                         </w:rPr>
                         <w:t xml:space="preserve"> </w:t>
                       </w:r>
-                      <w:proofErr w:type="spellStart"/>
                       <w:r>
                         <w:rPr>
                           <w:sz w:val="18"/>
                           <w:szCs w:val="18"/>
+                          <w:highlight w:val="yellow"/>
                         </w:rPr>
-                        <w:t>XXXXXX</w:t>
+                        <w:t>{{</w:t>
                       </w:r>
-                      <w:proofErr w:type="spellEnd"/>
+                      <w:r>
+                        <w:rPr>
+                          <w:sz w:val="18"/>
+                          <w:szCs w:val="18"/>
+                          <w:highlight w:val="yellow"/>
+                        </w:rPr>
+                        <w:t>CLIENTE</w:t>
+                      </w:r>
+                      <w:r>
+                        <w:rPr>
+                          <w:sz w:val="18"/>
+                          <w:szCs w:val="18"/>
+                          <w:highlight w:val="yellow"/>
+                        </w:rPr>
+                        <w:t>}}</w:t>
+                      </w:r>
                       <w:r>
                         <w:rPr>
                           <w:sz w:val="18"/>
@@ -7082,21 +7035,34 @@
         </w:rPr>
         <w:t xml:space="preserve"> de </w:t>
       </w:r>
-      <w:proofErr w:type="spellStart"/>
       <w:r>
         <w:rPr>
           <w:sz w:val="18"/>
           <w:szCs w:val="18"/>
           <w:highlight w:val="yellow"/>
         </w:rPr>
-        <w:t>xxxx</w:t>
-      </w:r>
-      <w:proofErr w:type="spellEnd"/>
+        <w:t>{{</w:t>
+      </w:r>
       <w:r>
         <w:rPr>
           <w:sz w:val="18"/>
           <w:szCs w:val="18"/>
           <w:highlight w:val="yellow"/>
+        </w:rPr>
+        <w:t>PROYECTO</w:t>
+      </w:r>
+      <w:r>
+        <w:rPr>
+          <w:sz w:val="18"/>
+          <w:szCs w:val="18"/>
+          <w:highlight w:val="yellow"/>
+        </w:rPr>
+        <w:t>}}</w:t>
+      </w:r>
+      <w:r>
+        <w:rPr>
+          <w:sz w:val="18"/>
+          <w:szCs w:val="18"/>
         </w:rPr>
         <w:t>.</w:t>
       </w:r>
@@ -7123,12 +7089,12 @@
         <w:tblLook w:val="04A0" w:firstRow="1" w:lastRow="0" w:firstColumn="1" w:lastColumn="0" w:noHBand="0" w:noVBand="1"/>
       </w:tblPr>
       <w:tblGrid>
-        <w:gridCol w:w="438"/>
-        <w:gridCol w:w="2249"/>
-        <w:gridCol w:w="1336"/>
-        <w:gridCol w:w="1336"/>
-        <w:gridCol w:w="1336"/>
-        <w:gridCol w:w="2372"/>
+        <w:gridCol w:w="1355"/>
+        <w:gridCol w:w="2025"/>
+        <w:gridCol w:w="1253"/>
+        <w:gridCol w:w="1226"/>
+        <w:gridCol w:w="1303"/>
+        <w:gridCol w:w="2188"/>
       </w:tblGrid>
       <w:tr>
         <w:tc>
@@ -7266,6 +7232,359 @@
                 <w:szCs w:val="18"/>
               </w:rPr>
             </w:pPr>
+            <w:r>
+              <w:rPr>
+                <w:sz w:val="18"/>
+                <w:szCs w:val="18"/>
+              </w:rPr>
+              <w:t xml:space="preserve">{% </w:t>
+            </w:r>
+            <w:proofErr w:type="spellStart"/>
+            <w:r>
+              <w:rPr>
+                <w:sz w:val="18"/>
+                <w:szCs w:val="18"/>
+              </w:rPr>
+              <w:t>for</w:t>
+            </w:r>
+            <w:proofErr w:type="spellEnd"/>
+            <w:r>
+              <w:rPr>
+                <w:sz w:val="18"/>
+                <w:szCs w:val="18"/>
+              </w:rPr>
+              <w:t xml:space="preserve"> t</w:t>
+            </w:r>
+            <w:r>
+              <w:rPr>
+                <w:sz w:val="18"/>
+                <w:szCs w:val="18"/>
+              </w:rPr>
+              <w:t xml:space="preserve"> </w:t>
+            </w:r>
+            <w:r>
+              <w:rPr>
+                <w:sz w:val="18"/>
+                <w:szCs w:val="18"/>
+              </w:rPr>
+              <w:t>in trabajadores %}</w:t>
+            </w:r>
+            <w:r>
+              <w:rPr>
+                <w:sz w:val="18"/>
+                <w:szCs w:val="18"/>
+              </w:rPr>
+              <w:br/>
+            </w:r>
+            <w:proofErr w:type="gramStart"/>
+            <w:r>
+              <w:rPr>
+                <w:sz w:val="18"/>
+                <w:szCs w:val="18"/>
+              </w:rPr>
+              <w:t xml:space="preserve">{{ </w:t>
+            </w:r>
+            <w:proofErr w:type="spellStart"/>
+            <w:r>
+              <w:rPr>
+                <w:sz w:val="18"/>
+                <w:szCs w:val="18"/>
+              </w:rPr>
+              <w:t>loop</w:t>
+            </w:r>
+            <w:proofErr w:type="gramEnd"/>
+            <w:r>
+              <w:rPr>
+                <w:sz w:val="18"/>
+                <w:szCs w:val="18"/>
+              </w:rPr>
+              <w:t>.index</w:t>
+            </w:r>
+            <w:proofErr w:type="spellEnd"/>
+            <w:r>
+              <w:rPr>
+                <w:sz w:val="18"/>
+                <w:szCs w:val="18"/>
+              </w:rPr>
+              <w:t xml:space="preserve"> }}</w:t>
+            </w:r>
+          </w:p>
+        </w:tc>
+        <w:tc>
+          <w:tcPr>
+            <w:tcW w:w="2249" w:type="dxa"/>
+          </w:tcPr>
+          <w:p>
+            <w:pPr>
+              <w:rPr>
+                <w:sz w:val="18"/>
+                <w:szCs w:val="18"/>
+              </w:rPr>
+            </w:pPr>
+            <w:r>
+              <w:rPr>
+                <w:sz w:val="18"/>
+                <w:szCs w:val="18"/>
+                <w:highlight w:val="yellow"/>
+              </w:rPr>
+              <w:t>{{</w:t>
+            </w:r>
+            <w:proofErr w:type="spellStart"/>
+            <w:proofErr w:type="gramStart"/>
+            <w:r>
+              <w:rPr>
+                <w:sz w:val="18"/>
+                <w:szCs w:val="18"/>
+                <w:highlight w:val="yellow"/>
+              </w:rPr>
+              <w:t>t.nombre</w:t>
+            </w:r>
+            <w:proofErr w:type="spellEnd"/>
+            <w:proofErr w:type="gramEnd"/>
+            <w:r>
+              <w:rPr>
+                <w:sz w:val="18"/>
+                <w:szCs w:val="18"/>
+                <w:highlight w:val="yellow"/>
+              </w:rPr>
+              <w:t>}}</w:t>
+            </w:r>
+          </w:p>
+        </w:tc>
+        <w:tc>
+          <w:tcPr>
+            <w:tcW w:w="1336" w:type="dxa"/>
+          </w:tcPr>
+          <w:p>
+            <w:pPr>
+              <w:rPr>
+                <w:sz w:val="18"/>
+                <w:szCs w:val="18"/>
+                <w:highlight w:val="yellow"/>
+              </w:rPr>
+            </w:pPr>
+            <w:r>
+              <w:rPr>
+                <w:sz w:val="18"/>
+                <w:szCs w:val="18"/>
+                <w:highlight w:val="yellow"/>
+              </w:rPr>
+              <w:t>{{</w:t>
+            </w:r>
+            <w:proofErr w:type="spellStart"/>
+            <w:proofErr w:type="gramStart"/>
+            <w:r>
+              <w:rPr>
+                <w:sz w:val="18"/>
+                <w:szCs w:val="18"/>
+                <w:highlight w:val="yellow"/>
+              </w:rPr>
+              <w:t>t.</w:t>
+            </w:r>
+            <w:r>
+              <w:rPr>
+                <w:sz w:val="18"/>
+                <w:szCs w:val="18"/>
+                <w:highlight w:val="yellow"/>
+              </w:rPr>
+              <w:t>curp</w:t>
+            </w:r>
+            <w:proofErr w:type="spellEnd"/>
+            <w:proofErr w:type="gramEnd"/>
+            <w:r>
+              <w:rPr>
+                <w:sz w:val="18"/>
+                <w:szCs w:val="18"/>
+                <w:highlight w:val="yellow"/>
+              </w:rPr>
+              <w:t>}}</w:t>
+            </w:r>
+          </w:p>
+        </w:tc>
+        <w:tc>
+          <w:tcPr>
+            <w:tcW w:w="1336" w:type="dxa"/>
+          </w:tcPr>
+          <w:p>
+            <w:pPr>
+              <w:rPr>
+                <w:sz w:val="18"/>
+                <w:szCs w:val="18"/>
+                <w:highlight w:val="yellow"/>
+              </w:rPr>
+            </w:pPr>
+            <w:r>
+              <w:rPr>
+                <w:sz w:val="18"/>
+                <w:szCs w:val="18"/>
+                <w:highlight w:val="yellow"/>
+              </w:rPr>
+              <w:t>{{</w:t>
+            </w:r>
+            <w:proofErr w:type="spellStart"/>
+            <w:r>
+              <w:rPr>
+                <w:sz w:val="18"/>
+                <w:szCs w:val="18"/>
+                <w:highlight w:val="yellow"/>
+              </w:rPr>
+              <w:t>t.</w:t>
+            </w:r>
+            <w:r>
+              <w:rPr>
+                <w:sz w:val="18"/>
+                <w:szCs w:val="18"/>
+                <w:highlight w:val="yellow"/>
+              </w:rPr>
+              <w:t>nss</w:t>
+            </w:r>
+            <w:proofErr w:type="spellEnd"/>
+            <w:r>
+              <w:rPr>
+                <w:sz w:val="18"/>
+                <w:szCs w:val="18"/>
+                <w:highlight w:val="yellow"/>
+              </w:rPr>
+              <w:t>}}</w:t>
+            </w:r>
+          </w:p>
+        </w:tc>
+        <w:tc>
+          <w:tcPr>
+            <w:tcW w:w="1336" w:type="dxa"/>
+          </w:tcPr>
+          <w:p>
+            <w:pPr>
+              <w:rPr>
+                <w:sz w:val="18"/>
+                <w:szCs w:val="18"/>
+                <w:highlight w:val="yellow"/>
+              </w:rPr>
+            </w:pPr>
+            <w:r>
+              <w:rPr>
+                <w:sz w:val="18"/>
+                <w:szCs w:val="18"/>
+                <w:highlight w:val="yellow"/>
+              </w:rPr>
+              <w:t>{{</w:t>
+            </w:r>
+            <w:proofErr w:type="spellStart"/>
+            <w:proofErr w:type="gramStart"/>
+            <w:r>
+              <w:rPr>
+                <w:sz w:val="18"/>
+                <w:szCs w:val="18"/>
+                <w:highlight w:val="yellow"/>
+              </w:rPr>
+              <w:t>t.</w:t>
+            </w:r>
+            <w:r>
+              <w:rPr>
+                <w:sz w:val="18"/>
+                <w:szCs w:val="18"/>
+                <w:highlight w:val="yellow"/>
+              </w:rPr>
+              <w:t>puesto</w:t>
+            </w:r>
+            <w:proofErr w:type="spellEnd"/>
+            <w:proofErr w:type="gramEnd"/>
+            <w:r>
+              <w:rPr>
+                <w:sz w:val="18"/>
+                <w:szCs w:val="18"/>
+                <w:highlight w:val="yellow"/>
+              </w:rPr>
+              <w:t>}}</w:t>
+            </w:r>
+          </w:p>
+        </w:tc>
+        <w:tc>
+          <w:tcPr>
+            <w:tcW w:w="2372" w:type="dxa"/>
+          </w:tcPr>
+          <w:p>
+            <w:pPr>
+              <w:rPr>
+                <w:sz w:val="18"/>
+                <w:szCs w:val="18"/>
+                <w:highlight w:val="yellow"/>
+              </w:rPr>
+            </w:pPr>
+            <w:r>
+              <w:rPr>
+                <w:sz w:val="18"/>
+                <w:szCs w:val="18"/>
+                <w:highlight w:val="yellow"/>
+              </w:rPr>
+              <w:t>{{</w:t>
+            </w:r>
+            <w:proofErr w:type="spellStart"/>
+            <w:proofErr w:type="gramStart"/>
+            <w:r>
+              <w:rPr>
+                <w:sz w:val="18"/>
+                <w:szCs w:val="18"/>
+                <w:highlight w:val="yellow"/>
+              </w:rPr>
+              <w:t>t.</w:t>
+            </w:r>
+            <w:r>
+              <w:rPr>
+                <w:sz w:val="18"/>
+                <w:szCs w:val="18"/>
+                <w:highlight w:val="yellow"/>
+              </w:rPr>
+              <w:t>actividades</w:t>
+            </w:r>
+            <w:proofErr w:type="spellEnd"/>
+            <w:proofErr w:type="gramEnd"/>
+            <w:r>
+              <w:rPr>
+                <w:sz w:val="18"/>
+                <w:szCs w:val="18"/>
+                <w:highlight w:val="yellow"/>
+              </w:rPr>
+              <w:t>}}</w:t>
+            </w:r>
+          </w:p>
+        </w:tc>
+      </w:tr>
+      <w:tr>
+        <w:tc>
+          <w:tcPr>
+            <w:tcW w:w="438" w:type="dxa"/>
+          </w:tcPr>
+          <w:p>
+            <w:pPr>
+              <w:rPr>
+                <w:sz w:val="18"/>
+                <w:szCs w:val="18"/>
+              </w:rPr>
+            </w:pPr>
+            <w:r>
+              <w:rPr>
+                <w:sz w:val="18"/>
+                <w:szCs w:val="18"/>
+              </w:rPr>
+              <w:t xml:space="preserve">{% </w:t>
+            </w:r>
+            <w:proofErr w:type="spellStart"/>
+            <w:r>
+              <w:rPr>
+                <w:sz w:val="18"/>
+                <w:szCs w:val="18"/>
+              </w:rPr>
+              <w:t>endfor</w:t>
+            </w:r>
+            <w:proofErr w:type="spellEnd"/>
+            <w:r>
+              <w:rPr>
+                <w:sz w:val="18"/>
+                <w:szCs w:val="18"/>
+              </w:rPr>
+              <w:t xml:space="preserve"> %}</w:t>
+            </w:r>
           </w:p>
         </w:tc>
         <w:tc>
@@ -7663,7 +7982,6 @@
                               </w:rPr>
                               <w:t xml:space="preserve">, EN REPRESENTACIÓN DE </w:t>
                             </w:r>
-                            <w:proofErr w:type="spellStart"/>
                             <w:r>
                               <w:rPr>
                                 <w:sz w:val="18"/>
@@ -7671,7 +7989,6 @@
                               </w:rPr>
                               <w:t>IDINEE</w:t>
                             </w:r>
-                            <w:proofErr w:type="spellEnd"/>
                             <w:r>
                               <w:rPr>
                                 <w:sz w:val="18"/>
@@ -7842,15 +8159,30 @@
                                 <w:szCs w:val="18"/>
                               </w:rPr>
                             </w:pPr>
-                            <w:proofErr w:type="spellStart"/>
                             <w:r>
                               <w:rPr>
                                 <w:sz w:val="18"/>
                                 <w:szCs w:val="18"/>
+                                <w:highlight w:val="yellow"/>
                               </w:rPr>
-                              <w:t>XXXXXX</w:t>
+                              <w:t>{{</w:t>
                             </w:r>
-                            <w:proofErr w:type="spellEnd"/>
+                            <w:r>
+                              <w:rPr>
+                                <w:sz w:val="18"/>
+                                <w:szCs w:val="18"/>
+                                <w:highlight w:val="yellow"/>
+                              </w:rPr>
+                              <w:t>REPRESENTANTE</w:t>
+                            </w:r>
+                            <w:r>
+                              <w:rPr>
+                                <w:sz w:val="18"/>
+                                <w:szCs w:val="18"/>
+                                <w:highlight w:val="yellow"/>
+                              </w:rPr>
+                              <w:t>}}</w:t>
+                            </w:r>
                             <w:r>
                               <w:rPr>
                                 <w:sz w:val="18"/>
@@ -7897,15 +8229,30 @@
                               </w:rPr>
                               <w:t xml:space="preserve"> </w:t>
                             </w:r>
-                            <w:proofErr w:type="spellStart"/>
                             <w:r>
                               <w:rPr>
                                 <w:sz w:val="18"/>
                                 <w:szCs w:val="18"/>
+                                <w:highlight w:val="yellow"/>
                               </w:rPr>
-                              <w:t>XXXXXX</w:t>
+                              <w:t>{{</w:t>
                             </w:r>
-                            <w:proofErr w:type="spellEnd"/>
+                            <w:r>
+                              <w:rPr>
+                                <w:sz w:val="18"/>
+                                <w:szCs w:val="18"/>
+                                <w:highlight w:val="yellow"/>
+                              </w:rPr>
+                              <w:t>CLIENTE</w:t>
+                            </w:r>
+                            <w:r>
+                              <w:rPr>
+                                <w:sz w:val="18"/>
+                                <w:szCs w:val="18"/>
+                                <w:highlight w:val="yellow"/>
+                              </w:rPr>
+                              <w:t>}}</w:t>
+                            </w:r>
                             <w:r>
                               <w:rPr>
                                 <w:sz w:val="18"/>
@@ -7947,15 +8294,30 @@
                           <w:szCs w:val="18"/>
                         </w:rPr>
                       </w:pPr>
-                      <w:proofErr w:type="spellStart"/>
                       <w:r>
                         <w:rPr>
                           <w:sz w:val="18"/>
                           <w:szCs w:val="18"/>
+                          <w:highlight w:val="yellow"/>
                         </w:rPr>
-                        <w:t>XXXXXX</w:t>
+                        <w:t>{{</w:t>
                       </w:r>
-                      <w:proofErr w:type="spellEnd"/>
+                      <w:r>
+                        <w:rPr>
+                          <w:sz w:val="18"/>
+                          <w:szCs w:val="18"/>
+                          <w:highlight w:val="yellow"/>
+                        </w:rPr>
+                        <w:t>REPRESENTANTE</w:t>
+                      </w:r>
+                      <w:r>
+                        <w:rPr>
+                          <w:sz w:val="18"/>
+                          <w:szCs w:val="18"/>
+                          <w:highlight w:val="yellow"/>
+                        </w:rPr>
+                        <w:t>}}</w:t>
+                      </w:r>
                       <w:r>
                         <w:rPr>
                           <w:sz w:val="18"/>
@@ -8002,15 +8364,30 @@
                         </w:rPr>
                         <w:t xml:space="preserve"> </w:t>
                       </w:r>
-                      <w:proofErr w:type="spellStart"/>
                       <w:r>
                         <w:rPr>
                           <w:sz w:val="18"/>
                           <w:szCs w:val="18"/>
+                          <w:highlight w:val="yellow"/>
                         </w:rPr>
-                        <w:t>XXXXXX</w:t>
+                        <w:t>{{</w:t>
                       </w:r>
-                      <w:proofErr w:type="spellEnd"/>
+                      <w:r>
+                        <w:rPr>
+                          <w:sz w:val="18"/>
+                          <w:szCs w:val="18"/>
+                          <w:highlight w:val="yellow"/>
+                        </w:rPr>
+                        <w:t>CLIENTE</w:t>
+                      </w:r>
+                      <w:r>
+                        <w:rPr>
+                          <w:sz w:val="18"/>
+                          <w:szCs w:val="18"/>
+                          <w:highlight w:val="yellow"/>
+                        </w:rPr>
+                        <w:t>}}</w:t>
+                      </w:r>
                       <w:r>
                         <w:rPr>
                           <w:sz w:val="18"/>
@@ -8266,11 +8643,27 @@
     </w:r>
     <w:r>
       <w:rPr>
-        <w:sz w:val="20"/>
+        <w:sz w:val="18"/>
         <w:szCs w:val="18"/>
         <w:highlight w:val="yellow"/>
       </w:rPr>
-      <w:t>XXX</w:t>
+      <w:t>{{</w:t>
+    </w:r>
+    <w:r>
+      <w:rPr>
+        <w:sz w:val="18"/>
+        <w:szCs w:val="18"/>
+        <w:highlight w:val="yellow"/>
+      </w:rPr>
+      <w:t>NOMENCLATURA</w:t>
+    </w:r>
+    <w:r>
+      <w:rPr>
+        <w:sz w:val="18"/>
+        <w:szCs w:val="18"/>
+        <w:highlight w:val="yellow"/>
+      </w:rPr>
+      <w:t>}}</w:t>
     </w:r>
     <w:r>
       <w:rPr>
@@ -10850,7 +11243,7 @@
   <w:style w:type="paragraph" w:default="1" w:styleId="Normal">
     <w:name w:val="Normal"/>
     <w:qFormat/>
-    <w:rsid w:val="005633C0"/>
+    <w:rsid w:val="009347C7"/>
     <w:pPr>
       <w:spacing w:line="360" w:lineRule="auto"/>
       <w:jc w:val="both"/>
@@ -10886,7 +11279,6 @@
   <w:style w:type="character" w:default="1" w:styleId="Fuentedeprrafopredeter">
     <w:name w:val="Default Paragraph Font"/>
     <w:uiPriority w:val="1"/>
-    <w:semiHidden/>
     <w:unhideWhenUsed/>
   </w:style>
   <w:style w:type="table" w:default="1" w:styleId="Tablanormal">

</xml_diff>